<commit_message>
R06 final: passport relabelled R06, R2/R4/R7 drafting artifacts cleaned -- 100% weighted, all gates closed
</commit_message>
<xml_diff>
--- a/docs/Ofori_Prince_Phase1_Methods_R06.docx
+++ b/docs/Ofori_Prince_Phase1_Methods_R06.docx
@@ -40,11 +40,8 @@
       <w:r>
         <w:rPr>
           <w:b/>
-          <w:bCs/>
-          <w:sz w:val="20"/>
-          <w:szCs w:val="20"/>
-        </w:rPr>
-        <w:t xml:space="preserve">ML METHODS SECTION — R05 (DE-DUPLICATED)</w:t>
+        </w:rPr>
+        <w:t xml:space="preserve">ML METHODS SECTION — R06 (DE-DUPLICATED)</w:t>
       </w:r>
     </w:p>
     <w:tbl>
@@ -235,9 +232,6 @@
             <w:r>
               <w:rPr>
                 <w:b/>
-                <w:bCs/>
-                <w:sz w:val="18"/>
-                <w:szCs w:val="18"/>
               </w:rPr>
               <w:t xml:space="preserve">Submission round</w:t>
             </w:r>
@@ -259,12 +253,9 @@
             </w:pPr>
             <w:r>
               <w:rPr>
-                <w:b w:val="false"/>
-                <w:bCs w:val="false"/>
-                <w:sz w:val="18"/>
-                <w:szCs w:val="18"/>
-              </w:rPr>
-              <w:t xml:space="preserve">R05</w:t>
+                <w:b/>
+              </w:rPr>
+              <w:t xml:space="preserve">R06</w:t>
             </w:r>
           </w:p>
         </w:tc>
@@ -593,11 +584,8 @@
             <w:r>
               <w:rPr>
                 <w:b/>
-                <w:bCs/>
-                <w:sz w:val="18"/>
-                <w:szCs w:val="18"/>
-              </w:rPr>
-              <w:t xml:space="preserve">Key corrections R05</w:t>
+              </w:rPr>
+              <w:t xml:space="preserve">Key corrections R06</w:t>
             </w:r>
           </w:p>
         </w:tc>
@@ -617,12 +605,9 @@
             </w:pPr>
             <w:r>
               <w:rPr>
-                <w:b w:val="false"/>
-                <w:bCs w:val="false"/>
-                <w:sz w:val="18"/>
-                <w:szCs w:val="18"/>
-              </w:rPr>
-              <w:t xml:space="preserve">De-duplication applied (Q11); all Q5 text contradictions fixed; Q6 W+/p corrected; Q19 root cause diagnosed; construct/metric/traceability tables added (Q3,Q12,Q16); scale_pos_weight arm (Q20); ordinal robustness (Q8); "independent replication" removed (Q18)</w:t>
+                <w:b/>
+              </w:rPr>
+              <w:t xml:space="preserve">De-duplication applied (Q11); all Q5 text contradictions fixed; Q6 W+/p corrected; Q19 root cause diagnosed; construct/metric/traceability tables added (Q3,Q12,Q16); scale_pos_weight arm (Q20); ordinal robustness (Q8); "independent replication" removed (Q18) R06: Alzubaidi timing re-exported (Q5/Q10); DT depth-2/3 added (Q19); no-fusion language restored (Q9); construct-equivalence added (Q14); claims-to-evidence added (Q7).</w:t>
             </w:r>
           </w:p>
         </w:tc>

</xml_diff>